<commit_message>
business plan and LOs updates
</commit_message>
<xml_diff>
--- a/UI_Software_Project_Initiation_and_Planning/Digital_Portfolio_UI110021_Project_initiation_planning.docx
+++ b/UI_Software_Project_Initiation_and_Planning/Digital_Portfolio_UI110021_Project_initiation_planning.docx
@@ -1508,7 +1508,7 @@
                 <w:rFonts w:cs="Calibri" w:asciiTheme="minorHAnsi" w:hAnsiTheme="minorHAnsi"/>
                 <w:lang w:val="en-GB"/>
               </w:rPr>
-              <w:t xml:space="preserve">I have created a business plan that justifies why the project is valuable, fundable and necessary (https://github.com/TortoiseLeaf/laurenk_personal_repository_2025/blob/main/UI_Software_Project_Initiation_and_Planning/Business%20Plan%20Template%20ASD.</w:t>
+              <w:t xml:space="preserve">I have created a business plan that provides justification for why the project is valuable, fundable and necessary through descriptions of the business idea and mission statement along with a market analysis which outlines the target market and demand for the product. This is evidenced in the document here (https://github.com/TortoiseLeaf/laurenk_personal_repository_2025/blob/main/UI_Software_Project_Initiation_and_Planning/Business%20Plan%20Template%20ASD.</w:t>
             </w:r>
             <w:commentRangeStart w:id="0"/>
             <w:r>
@@ -1549,6 +1549,8 @@
               <w:ind/>
               <w:rPr>
                 <w:rFonts w:cs="Calibri" w:asciiTheme="minorHAnsi" w:hAnsiTheme="minorHAnsi"/>
+                <w:highlight w:val="none"/>
+                <w:lang w:val="en-GB"/>
               </w:rPr>
             </w:pPr>
             <w:r>
@@ -1556,32 +1558,43 @@
                 <w:rFonts w:cs="Calibri" w:asciiTheme="minorHAnsi" w:hAnsiTheme="minorHAnsi"/>
                 <w:lang w:val="en-GB"/>
               </w:rPr>
-              <w:t xml:space="preserve">(</w:t>
-            </w:r>
-            <w:r>
-              <w:rPr>
-                <w:rFonts w:cs="Calibri" w:asciiTheme="minorHAnsi" w:hAnsiTheme="minorHAnsi"/>
-                <w:b/>
-                <w:bCs/>
-                <w:lang w:val="en-GB"/>
-              </w:rPr>
-              <w:t xml:space="preserve">This is a work in progress (WIP) and will include a cashflow forecast</w:t>
-            </w:r>
-            <w:r>
-              <w:rPr>
-                <w:rFonts w:cs="Calibri" w:asciiTheme="minorHAnsi" w:hAnsiTheme="minorHAnsi"/>
-                <w:lang w:val="en-GB"/>
-              </w:rPr>
-              <w:t xml:space="preserve">)</w:t>
+              <w:t xml:space="preserve">Deployment costs are covered by the funding as described in the cashflow forecast.</w:t>
             </w:r>
             <w:r>
               <w:rPr>
                 <w:rFonts w:cs="Calibri" w:asciiTheme="minorHAnsi" w:hAnsiTheme="minorHAnsi"/>
               </w:rPr>
             </w:r>
+          </w:p>
+          <w:p>
+            <w:pPr>
+              <w:pBdr/>
+              <w:spacing/>
+              <w:ind/>
+              <w:rPr>
+                <w:rFonts w:cs="Calibri" w:asciiTheme="minorHAnsi" w:hAnsiTheme="minorHAnsi"/>
+              </w:rPr>
+            </w:pPr>
             <w:r>
               <w:rPr>
                 <w:rFonts w:cs="Calibri" w:asciiTheme="minorHAnsi" w:hAnsiTheme="minorHAnsi"/>
+                <w:highlight w:val="none"/>
+                <w:lang w:val="en-GB"/>
+              </w:rPr>
+              <w:t xml:space="preserve">Update cashflow to include possible avenues of funding and further costs for development.</w:t>
+            </w:r>
+            <w:r>
+              <w:rPr>
+                <w:rFonts w:cs="Calibri" w:asciiTheme="minorHAnsi" w:hAnsiTheme="minorHAnsi"/>
+                <w:highlight w:val="none"/>
+                <w:lang w:val="en-GB"/>
+              </w:rPr>
+            </w:r>
+            <w:r>
+              <w:rPr>
+                <w:rFonts w:cs="Calibri" w:asciiTheme="minorHAnsi" w:hAnsiTheme="minorHAnsi"/>
+                <w:highlight w:val="none"/>
+                <w:lang w:val="en-GB"/>
               </w:rPr>
             </w:r>
           </w:p>
@@ -1798,13 +1811,33 @@
                 <w:color w:val="000000"/>
                 <w:lang w:val="en-GB"/>
               </w:rPr>
-              <w:t xml:space="preserve">Meeting minutes and recordings</w:t>
+              <w:t xml:space="preserve">Fluency in written communications to articulate complex issues with an appropriate structure, tone and language are evidenced in both t</w:t>
             </w:r>
             <w:r>
               <w:rPr>
                 <w:rFonts w:cs="Calibri" w:asciiTheme="minorHAnsi" w:hAnsiTheme="minorHAnsi"/>
                 <w:color w:val="000000"/>
                 <w:lang w:val="en-GB"/>
+              </w:rPr>
+            </w:r>
+            <w:r>
+              <w:rPr>
+                <w:rFonts w:cs="Calibri" w:asciiTheme="minorHAnsi" w:hAnsiTheme="minorHAnsi"/>
+                <w:color w:val="000000"/>
+                <w:lang w:val="en-GB"/>
+              </w:rPr>
+              <w:t xml:space="preserve">he requirements specification document (https://github.com/TortoiseLeaf/laurenk_personal_repository_2025/blob/main/UI_Software_Project_Initiation_and_Planning/SRS_MAUI.md)</w:t>
+            </w:r>
+            <w:r>
+              <w:rPr>
+                <w:rFonts w:cs="Calibri" w:asciiTheme="minorHAnsi" w:hAnsiTheme="minorHAnsi"/>
+                <w:color w:val="000000"/>
+              </w:rPr>
+            </w:r>
+            <w:r>
+              <w:rPr>
+                <w:rFonts w:cs="Calibri" w:asciiTheme="minorHAnsi" w:hAnsiTheme="minorHAnsi"/>
+                <w:color w:val="000000"/>
               </w:rPr>
             </w:r>
             <w:r>
@@ -1822,37 +1855,7 @@
               <w:ind/>
               <w:rPr>
                 <w:rFonts w:cs="Calibri" w:asciiTheme="minorHAnsi" w:hAnsiTheme="minorHAnsi"/>
-                <w:color w:val="000000"/>
-              </w:rPr>
-            </w:pPr>
-            <w:r>
-              <w:rPr>
-                <w:rFonts w:cs="Calibri" w:asciiTheme="minorHAnsi" w:hAnsiTheme="minorHAnsi"/>
-                <w:color w:val="000000"/>
-                <w:lang w:val="en-GB"/>
-              </w:rPr>
-              <w:t xml:space="preserve">Evidenced in the requirements specification document (https://github.com/TortoiseLeaf/laurenk_personal_repository_2025/blob/main/UI_Software_Project_Initiation_and_Planning/SRS_MAUI.md)</w:t>
-            </w:r>
-            <w:r>
-              <w:rPr>
-                <w:rFonts w:cs="Calibri" w:asciiTheme="minorHAnsi" w:hAnsiTheme="minorHAnsi"/>
-                <w:color w:val="000000"/>
-              </w:rPr>
-            </w:r>
-            <w:r>
-              <w:rPr>
-                <w:rFonts w:cs="Calibri" w:asciiTheme="minorHAnsi" w:hAnsiTheme="minorHAnsi"/>
-                <w:color w:val="000000"/>
-              </w:rPr>
-            </w:r>
-          </w:p>
-          <w:p>
-            <w:pPr>
-              <w:pBdr/>
-              <w:spacing w:after="40" w:before="40"/>
-              <w:ind/>
-              <w:rPr>
-                <w:rFonts w:cs="Calibri" w:asciiTheme="minorHAnsi" w:hAnsiTheme="minorHAnsi"/>
+                <w:highlight w:val="none"/>
                 <w:lang w:val="en-GB"/>
               </w:rPr>
             </w:pPr>
@@ -1862,7 +1865,7 @@
                 <w:color w:val="000000"/>
                 <w:lang w:val="en-GB"/>
               </w:rPr>
-              <w:t xml:space="preserve">And business plan </w:t>
+              <w:t xml:space="preserve">And also in the project business plan </w:t>
             </w:r>
             <w:r>
               <w:rPr>
@@ -1921,7 +1924,6 @@
               <w:rPr>
                 <w:rFonts w:cs="Calibri" w:asciiTheme="minorHAnsi" w:hAnsiTheme="minorHAnsi"/>
                 <w:color w:val="000000"/>
-                <w:lang w:val="en-GB"/>
               </w:rPr>
             </w:pPr>
             <w:r>
@@ -1930,7 +1932,21 @@
                 <w:color w:val="000000"/>
                 <w:lang w:val="en-GB"/>
               </w:rPr>
-              <w:t xml:space="preserve">Friday meeting (</w:t>
+              <w:t xml:space="preserve">These skills are also evidenced in stakeholder meetings like the recurring Friday meeting with delivery staff </w:t>
+            </w:r>
+            <w:r>
+              <w:rPr>
+                <w:rFonts w:cs="Calibri" w:asciiTheme="minorHAnsi" w:hAnsiTheme="minorHAnsi"/>
+                <w:color w:val="000000"/>
+              </w:rPr>
+            </w:r>
+            <w:r>
+              <w:rPr>
+                <w:rFonts w:cs="Calibri" w:asciiTheme="minorHAnsi" w:hAnsiTheme="minorHAnsi"/>
+                <w:color w:val="000000"/>
+                <w:lang w:val="en-GB"/>
+              </w:rPr>
+              <w:t xml:space="preserve">(</w:t>
             </w:r>
             <w:hyperlink r:id="rId10" w:tooltip="https://myuhi.sharepoint.com/sites/D2L-103823-group/_layouts/15/stream.aspx?id=%2Fsites%2FD2L%2D103823%2Dgroup%2FShared%20Documents%2FGeneral%2FRecordings%2FApplied%20Software%20Development%20%2D%20Weekly%20Friday%20Session%2D20251010%5F142858%2DMeeting%20Reco" w:history="1">
               <w:r>
@@ -1963,6 +1979,12 @@
                 <w:rFonts w:cs="Calibri" w:asciiTheme="minorHAnsi" w:hAnsiTheme="minorHAnsi"/>
                 <w:color w:val="000000"/>
                 <w:lang w:val="en-GB"/>
+              </w:rPr>
+            </w:r>
+            <w:r>
+              <w:rPr>
+                <w:rFonts w:cs="Calibri" w:asciiTheme="minorHAnsi" w:hAnsiTheme="minorHAnsi"/>
+                <w:color w:val="000000"/>
               </w:rPr>
             </w:r>
           </w:p>
@@ -2011,7 +2033,7 @@
                 <w:color w:val="000000"/>
                 <w:lang w:val="en-GB"/>
               </w:rPr>
-              <w:t xml:space="preserve">Friday sprint end (https://myuhi.sharepoint.com/sites/D2L-103823-group/_layouts/15/stream.aspx?id=%2Fsites%2FD2L%2D103823%2Dgroup%2FShared%20Documents%</w:t>
+              <w:t xml:space="preserve">And also in the Friday sprint end meetings (https://myuhi.sharepoint.com/sites/D2L-103823-group/_layouts/15/stream.aspx?id=%2Fsites%2FD2L%2D103823%2Dgroup%2FShared%20Documents%</w:t>
             </w:r>
             <w:r>
               <w:rPr>
@@ -2087,7 +2109,7 @@
                 <w:color w:val="000000"/>
                 <w:lang w:val="en-GB"/>
               </w:rPr>
-              <w:t xml:space="preserve">documentation</w:t>
+              <w:t xml:space="preserve">documentation can be found in the presentation slides for the project.</w:t>
             </w:r>
             <w:r>
               <w:rPr>
@@ -2178,7 +2200,13 @@
                 <w:rFonts w:cs="Calibri" w:asciiTheme="minorHAnsi" w:hAnsiTheme="minorHAnsi"/>
                 <w:lang w:val="en-GB"/>
               </w:rPr>
-              <w:t xml:space="preserve">And also</w:t>
+              <w:t xml:space="preserve">And also in another sprint end presentation here.</w:t>
+            </w:r>
+            <w:r>
+              <w:rPr>
+                <w:rFonts w:cs="Calibri" w:asciiTheme="minorHAnsi" w:hAnsiTheme="minorHAnsi"/>
+                <w:lang w:val="en-GB"/>
+              </w:rPr>
             </w:r>
             <w:r>
               <w:rPr>
@@ -2509,6 +2537,13 @@
                 <w:lang w:val="en-GB"/>
               </w:rPr>
             </w:r>
+            <w:r>
+              <w:rPr>
+                <w:rFonts w:cs="Calibri" w:asciiTheme="minorHAnsi" w:hAnsiTheme="minorHAnsi"/>
+                <w:color w:val="000000"/>
+                <w:lang w:val="en-GB"/>
+              </w:rPr>
+            </w:r>
           </w:p>
           <w:p>
             <w:pPr>
@@ -2518,6 +2553,7 @@
               <w:rPr>
                 <w:rFonts w:cs="Calibri" w:asciiTheme="minorHAnsi" w:hAnsiTheme="minorHAnsi"/>
                 <w:color w:val="000000"/>
+                <w:highlight w:val="none"/>
                 <w:lang w:val="en-GB"/>
               </w:rPr>
             </w:pPr>
@@ -2562,6 +2598,52 @@
                 <w:rFonts w:cs="Calibri" w:asciiTheme="minorHAnsi" w:hAnsiTheme="minorHAnsi"/>
                 <w:color w:val="000000"/>
                 <w:highlight w:val="none"/>
+                <w:lang w:val="en-GB" w:bidi="en-GB"/>
+              </w:rPr>
+            </w:pPr>
+            <w:r>
+              <w:rPr>
+                <w:rFonts w:cs="Calibri" w:asciiTheme="minorHAnsi" w:hAnsiTheme="minorHAnsi"/>
+                <w:color w:val="000000"/>
+                <w:highlight w:val="none"/>
+                <w:lang w:val="en-GB" w:bidi="en-GB"/>
+              </w:rPr>
+              <w:t xml:space="preserve">A shorter more direct version can also be found here (</w:t>
+            </w:r>
+            <w:r>
+              <w:rPr>
+                <w:rFonts w:cs="Calibri" w:asciiTheme="minorHAnsi" w:hAnsiTheme="minorHAnsi"/>
+                <w:color w:val="000000"/>
+                <w:highlight w:val="none"/>
+                <w:lang w:val="en-GB" w:bidi="en-GB"/>
+              </w:rPr>
+              <w:t xml:space="preserve">https://vimeo.com/1175150157</w:t>
+            </w:r>
+            <w:r>
+              <w:rPr>
+                <w:rFonts w:cs="Calibri" w:asciiTheme="minorHAnsi" w:hAnsiTheme="minorHAnsi"/>
+                <w:color w:val="000000"/>
+                <w:highlight w:val="none"/>
+                <w:lang w:val="en-GB" w:bidi="en-GB"/>
+              </w:rPr>
+              <w:t xml:space="preserve">)</w:t>
+            </w:r>
+            <w:r>
+              <w:rPr>
+                <w:rFonts w:cs="Calibri" w:asciiTheme="minorHAnsi" w:hAnsiTheme="minorHAnsi"/>
+                <w:color w:val="000000"/>
+                <w:lang w:val="en-GB"/>
+              </w:rPr>
+            </w:r>
+          </w:p>
+          <w:p>
+            <w:pPr>
+              <w:pBdr/>
+              <w:spacing w:after="40" w:before="40"/>
+              <w:ind/>
+              <w:rPr>
+                <w:rFonts w:cs="Calibri" w:asciiTheme="minorHAnsi" w:hAnsiTheme="minorHAnsi"/>
+                <w:color w:val="000000"/>
                 <w:lang w:val="en-GB"/>
               </w:rPr>
             </w:pPr>
@@ -2569,52 +2651,8 @@
               <w:rPr>
                 <w:rFonts w:cs="Calibri" w:asciiTheme="minorHAnsi" w:hAnsiTheme="minorHAnsi"/>
                 <w:color w:val="000000"/>
-                <w:lang w:val="en-GB"/>
-              </w:rPr>
-              <w:t xml:space="preserve">The video includes information on how design decisions like keeping the product almost entirely offline helps to</w:t>
-            </w:r>
-            <w:commentRangeStart w:id="3"/>
-            <w:r>
-              <w:rPr>
-                <w:rFonts w:cs="Calibri" w:asciiTheme="minorHAnsi" w:hAnsiTheme="minorHAnsi"/>
-                <w:color w:val="000000"/>
-                <w:lang w:val="en-GB"/>
-              </w:rPr>
-              <w:t xml:space="preserve"> </w:t>
-            </w:r>
-            <w:commentRangeEnd w:id="3"/>
-            <w:r>
-              <w:commentReference w:id="3"/>
-            </w:r>
-            <w:r>
-              <w:rPr>
-                <w:rFonts w:cs="Calibri" w:asciiTheme="minorHAnsi" w:hAnsiTheme="minorHAnsi"/>
-                <w:color w:val="000000"/>
-                <w:lang w:val="en-GB"/>
-              </w:rPr>
-              <w:t xml:space="preserve">protect user data and makes the application more</w:t>
-            </w:r>
-            <w:r>
-              <w:rPr>
-                <w:rFonts w:cs="Calibri" w:asciiTheme="minorHAnsi" w:hAnsiTheme="minorHAnsi"/>
-                <w:color w:val="000000"/>
-                <w:lang w:val="en-GB"/>
-              </w:rPr>
-              <w:t xml:space="preserve"> sec</w:t>
-            </w:r>
-            <w:r>
-              <w:rPr>
-                <w:rFonts w:cs="Calibri" w:asciiTheme="minorHAnsi" w:hAnsiTheme="minorHAnsi"/>
-                <w:color w:val="000000"/>
-                <w:lang w:val="en-GB"/>
-              </w:rPr>
-              <w:t xml:space="preserve">ure from attack by limiting connections to the internet which can be exploited by injection attacks, and explain how by using data already collected by the android device, user data is collected and protected by Android’s own robust coherence to GDPR laws.</w:t>
-            </w:r>
-            <w:r>
-              <w:rPr>
-                <w:rFonts w:cs="Calibri" w:asciiTheme="minorHAnsi" w:hAnsiTheme="minorHAnsi"/>
-                <w:color w:val="000000"/>
-                <w:lang w:val="en-GB"/>
+                <w:highlight w:val="none"/>
+                <w:lang w:val="en-GB" w:bidi="en-GB"/>
               </w:rPr>
             </w:r>
             <w:r>
@@ -2632,6 +2670,57 @@
                 <w:highlight w:val="none"/>
                 <w:lang w:val="en-GB" w:bidi="en-GB"/>
               </w:rPr>
+            </w:r>
+          </w:p>
+          <w:p>
+            <w:pPr>
+              <w:pBdr/>
+              <w:spacing w:after="40" w:before="40"/>
+              <w:ind/>
+              <w:rPr>
+                <w:rFonts w:cs="Calibri" w:asciiTheme="minorHAnsi" w:hAnsiTheme="minorHAnsi"/>
+                <w:color w:val="000000"/>
+                <w:highlight w:val="none"/>
+                <w:lang w:val="en-GB"/>
+              </w:rPr>
+            </w:pPr>
+            <w:r>
+              <w:rPr>
+                <w:rFonts w:cs="Calibri" w:asciiTheme="minorHAnsi" w:hAnsiTheme="minorHAnsi"/>
+                <w:color w:val="000000"/>
+                <w:lang w:val="en-GB"/>
+              </w:rPr>
+              <w:t xml:space="preserve">The longer video includes information on how design decisions like keeping the product almost entirely offline helps to p</w:t>
+            </w:r>
+            <w:commentRangeStart w:id="3"/>
+            <w:r/>
+            <w:commentRangeEnd w:id="3"/>
+            <w:r>
+              <w:commentReference w:id="3"/>
+            </w:r>
+            <w:r>
+              <w:rPr>
+                <w:rFonts w:cs="Calibri" w:asciiTheme="minorHAnsi" w:hAnsiTheme="minorHAnsi"/>
+                <w:color w:val="000000"/>
+                <w:lang w:val="en-GB"/>
+              </w:rPr>
+              <w:t xml:space="preserve">rotect user data and makes the application more</w:t>
+            </w:r>
+            <w:r>
+              <w:rPr>
+                <w:rFonts w:cs="Calibri" w:asciiTheme="minorHAnsi" w:hAnsiTheme="minorHAnsi"/>
+                <w:color w:val="000000"/>
+                <w:lang w:val="en-GB"/>
+              </w:rPr>
+              <w:t xml:space="preserve"> sec</w:t>
+            </w:r>
+            <w:r>
+              <w:rPr>
+                <w:rFonts w:cs="Calibri" w:asciiTheme="minorHAnsi" w:hAnsiTheme="minorHAnsi"/>
+                <w:color w:val="000000"/>
+                <w:lang w:val="en-GB"/>
+              </w:rPr>
+              <w:t xml:space="preserve">ure from attack by limiting connections to the internet which can be exploited by injection attacks, and explain how by using data already collected by the android device, user data is collected and protected by Android’s own robust coherence to GDPR laws.</w:t>
             </w:r>
             <w:r>
               <w:rPr>
@@ -2837,6 +2926,7 @@
               <w:rPr>
                 <w:rFonts w:cs="Calibri" w:asciiTheme="minorHAnsi" w:hAnsiTheme="minorHAnsi"/>
                 <w:color w:val="000000"/>
+                <w:highlight w:val="none"/>
                 <w:lang w:val="en-GB"/>
               </w:rPr>
             </w:r>
@@ -2922,7 +3012,6 @@
               <w:rPr>
                 <w:rFonts w:cs="Calibri" w:asciiTheme="minorHAnsi" w:hAnsiTheme="minorHAnsi"/>
                 <w:color w:val="000000"/>
-                <w:highlight w:val="none"/>
                 <w:lang w:val="en-GB"/>
               </w:rPr>
             </w:r>
@@ -2987,7 +3076,8 @@
               <w:rPr>
                 <w:rFonts w:cs="Calibri" w:asciiTheme="minorHAnsi" w:hAnsiTheme="minorHAnsi"/>
                 <w:color w:val="000000"/>
-                <w:lang w:val="en-GB"/>
+                <w:highlight w:val="none"/>
+                <w:lang w:val="en-GB" w:bidi="en-GB"/>
               </w:rPr>
             </w:r>
             <w:r>
@@ -3050,8 +3140,7 @@
               <w:rPr>
                 <w:rFonts w:cs="Calibri" w:asciiTheme="minorHAnsi" w:hAnsiTheme="minorHAnsi"/>
                 <w:color w:val="000000"/>
-                <w:highlight w:val="none"/>
-                <w:lang w:val="en-GB" w:bidi="en-GB"/>
+                <w:lang w:val="en-GB"/>
               </w:rPr>
             </w:r>
             <w:r>
@@ -3452,7 +3541,6 @@
             <w:r>
               <w:rPr>
                 <w:rFonts w:cs="Calibri" w:asciiTheme="minorHAnsi" w:hAnsiTheme="minorHAnsi"/>
-                <w:highlight w:val="none"/>
                 <w:lang w:val="en-GB"/>
               </w:rPr>
             </w:r>
@@ -3957,7 +4045,11 @@
             </w:r>
             <w:r>
               <w:rPr>
-                <w:rFonts w:cs="Calibri" w:asciiTheme="minorHAnsi" w:hAnsiTheme="minorHAnsi"/>
+                <w:rFonts w:ascii="Calibri" w:hAnsi="Calibri" w:eastAsia="Calibri" w:cs="Calibri"/>
+                <w:sz w:val="22"/>
+                <w:szCs w:val="22"/>
+                <w:highlight w:val="none"/>
+                <w:lang w:val="en-GB"/>
               </w:rPr>
             </w:r>
             <w:r>
@@ -4001,11 +4093,7 @@
             </w:r>
             <w:r>
               <w:rPr>
-                <w:rFonts w:ascii="Calibri" w:hAnsi="Calibri" w:eastAsia="Calibri" w:cs="Calibri"/>
-                <w:sz w:val="22"/>
-                <w:szCs w:val="22"/>
-                <w:highlight w:val="none"/>
-                <w:lang w:val="en-GB"/>
+                <w:rFonts w:cs="Calibri" w:asciiTheme="minorHAnsi" w:hAnsiTheme="minorHAnsi"/>
               </w:rPr>
             </w:r>
             <w:r>
@@ -4198,6 +4286,13 @@
           <w:szCs w:val="22"/>
         </w:rPr>
       </w:r>
+      <w:r>
+        <w:rPr>
+          <w:rFonts w:ascii="Aptos" w:hAnsi="Aptos" w:cs="Aptos"/>
+          <w:sz w:val="22"/>
+          <w:szCs w:val="22"/>
+        </w:rPr>
+      </w:r>
     </w:p>
     <w:p>
       <w:pPr>
@@ -4257,6 +4352,12 @@
       </w:r>
       <w:r>
         <w:rPr>
+          <w:lang w:val="en-GB" w:eastAsia="en-GB"/>
+        </w:rPr>
+      </w:r>
+      <w:r>
+        <w:rPr>
+          <w:highlight w:val="none"/>
           <w:lang w:val="en-GB" w:eastAsia="en-GB"/>
         </w:rPr>
       </w:r>
@@ -4340,6 +4441,12 @@
           <w:lang w:val="en-GB" w:eastAsia="en-GB" w:bidi="en-GB"/>
         </w:rPr>
         <w:t xml:space="preserve"> (Accessed: 19/03/2026)</w:t>
+      </w:r>
+      <w:r>
+        <w:rPr>
+          <w:bCs w:val="0"/>
+          <w:i w:val="0"/>
+        </w:rPr>
       </w:r>
       <w:r>
         <w:rPr>

</xml_diff>